<commit_message>
build(bo-nop): refresh submission bundle + zip with Appendix B β→r clarification
Rebuilt dist/BO_NOP_HOAN_CHINH_2026-06 (XeLaTeX + CTU docx) so the submitted
copies carry the new Phụ lục B sentence noting the β→r conversion uses only the
0.98 slope term of Peterson & Brown (2005). Verified: clause present in
phu_luc_B_maida_vi.docx and LUAN_AN_CTU_full.pdf (188 pages); re-zipped
BO_NOP_HOAN_CHINH_2026-06.zip (252 files).

Co-Authored-By: Claude Opus 4.8 (1M context) <noreply@anthropic.com>
Claude-Session: https://claude.ai/code/session_01Xumaoraa2DLWLXsgJJ62oq
</commit_message>
<xml_diff>
--- a/dist/BO_NOP_HOAN_CHINH_2026-06/3_luan_an_chuong_phu_luc/phu_luc_B_maida_vi.docx
+++ b/dist/BO_NOP_HOAN_CHINH_2026-06/3_luan_an_chuong_phu_luc/phu_luc_B_maida_vi.docx
@@ -669,6 +669,204 @@
     <w:p>
       <w:pPr>
         <w:pStyle w:val="FirstParagraph"/>
+      </w:pPr>
+      <w:r>
+        <w:t xml:space="preserve">Phép chuyển từ</w:t>
+      </w:r>
+      <w:r>
+        <w:t xml:space="preserve"> </w:t>
+      </w:r>
+      <m:oMath>
+        <m:r>
+          <m:t>β</m:t>
+        </m:r>
+      </m:oMath>
+      <w:r>
+        <w:t xml:space="preserve"> </w:t>
+      </w:r>
+      <w:r>
+        <w:t xml:space="preserve">chỉ dùng số hạng độ dốc</w:t>
+      </w:r>
+      <w:r>
+        <w:t xml:space="preserve"> </w:t>
+      </w:r>
+      <m:oMath>
+        <m:r>
+          <m:t>0</m:t>
+        </m:r>
+        <m:r>
+          <m:rPr>
+            <m:sty m:val="p"/>
+          </m:rPr>
+          <m:t>,</m:t>
+        </m:r>
+        <m:r>
+          <m:t>98</m:t>
+        </m:r>
+      </m:oMath>
+      <w:r>
+        <w:t xml:space="preserve"> </w:t>
+      </w:r>
+      <w:r>
+        <w:t xml:space="preserve">của Peterson và Brown (2005), bỏ</w:t>
+      </w:r>
+      <w:r>
+        <w:t xml:space="preserve"> </w:t>
+      </w:r>
+      <w:r>
+        <w:t xml:space="preserve">hệ số chặn</w:t>
+      </w:r>
+      <w:r>
+        <w:t xml:space="preserve"> </w:t>
+      </w:r>
+      <m:oMath>
+        <m:r>
+          <m:rPr>
+            <m:sty m:val="p"/>
+          </m:rPr>
+          <m:t>+</m:t>
+        </m:r>
+        <m:r>
+          <m:t>0</m:t>
+        </m:r>
+        <m:r>
+          <m:rPr>
+            <m:sty m:val="p"/>
+          </m:rPr>
+          <m:t>,</m:t>
+        </m:r>
+        <m:r>
+          <m:t>05</m:t>
+        </m:r>
+        <m:r>
+          <m:t>λ</m:t>
+        </m:r>
+      </m:oMath>
+      <w:r>
+        <w:t xml:space="preserve"> </w:t>
+      </w:r>
+      <w:r>
+        <w:t xml:space="preserve">trong công thức gốc của hai tác giả. Cách làm này trùng khít với</w:t>
+      </w:r>
+      <w:r>
+        <w:t xml:space="preserve"> </w:t>
+      </w:r>
+      <w:r>
+        <w:t xml:space="preserve">Peterson và Brown khi</w:t>
+      </w:r>
+      <w:r>
+        <w:t xml:space="preserve"> </w:t>
+      </w:r>
+      <m:oMath>
+        <m:r>
+          <m:t>β</m:t>
+        </m:r>
+      </m:oMath>
+      <w:r>
+        <w:t xml:space="preserve"> </w:t>
+      </w:r>
+      <w:r>
+        <w:t xml:space="preserve">âm và làm</w:t>
+      </w:r>
+      <w:r>
+        <w:t xml:space="preserve"> </w:t>
+      </w:r>
+      <m:oMath>
+        <m:d>
+          <m:dPr>
+            <m:begChr m:val="|"/>
+            <m:endChr m:val="|"/>
+            <m:sepChr m:val=""/>
+            <m:grow/>
+          </m:dPr>
+          <m:e>
+            <m:r>
+              <m:t>r</m:t>
+            </m:r>
+          </m:e>
+        </m:d>
+      </m:oMath>
+      <w:r>
+        <w:t xml:space="preserve"> </w:t>
+      </w:r>
+      <w:r>
+        <w:t xml:space="preserve">nhỏ đi</w:t>
+      </w:r>
+      <w:r>
+        <w:t xml:space="preserve"> </w:t>
+      </w:r>
+      <m:oMath>
+        <m:r>
+          <m:t>0</m:t>
+        </m:r>
+        <m:r>
+          <m:rPr>
+            <m:sty m:val="p"/>
+          </m:rPr>
+          <m:t>,</m:t>
+        </m:r>
+        <m:r>
+          <m:t>05</m:t>
+        </m:r>
+      </m:oMath>
+      <w:r>
+        <w:t xml:space="preserve"> </w:t>
+      </w:r>
+      <w:r>
+        <w:t xml:space="preserve">khi</w:t>
+      </w:r>
+      <w:r>
+        <w:t xml:space="preserve"> </w:t>
+      </w:r>
+      <m:oMath>
+        <m:r>
+          <m:t>β</m:t>
+        </m:r>
+      </m:oMath>
+      <w:r>
+        <w:t xml:space="preserve"> </w:t>
+      </w:r>
+      <w:r>
+        <w:t xml:space="preserve">dương, tức thiên về</w:t>
+      </w:r>
+      <w:r>
+        <w:t xml:space="preserve"> </w:t>
+      </w:r>
+      <w:r>
+        <w:t xml:space="preserve">hướng thận trọng (không thổi phồng hiệu ứng); dấu của</w:t>
+      </w:r>
+      <w:r>
+        <w:t xml:space="preserve"> </w:t>
+      </w:r>
+      <m:oMath>
+        <m:r>
+          <m:t>t</m:t>
+        </m:r>
+      </m:oMath>
+      <w:r>
+        <w:t xml:space="preserve"> </w:t>
+      </w:r>
+      <w:r>
+        <w:t xml:space="preserve">và</w:t>
+      </w:r>
+      <w:r>
+        <w:t xml:space="preserve"> </w:t>
+      </w:r>
+      <m:oMath>
+        <m:r>
+          <m:t>β</m:t>
+        </m:r>
+      </m:oMath>
+      <w:r>
+        <w:t xml:space="preserve"> </w:t>
+      </w:r>
+      <w:r>
+        <w:t xml:space="preserve">luôn được giữ nguyên.</w:t>
+      </w:r>
+    </w:p>
+    <w:p>
+      <w:pPr>
+        <w:pStyle w:val="BodyText"/>
       </w:pPr>
       <w:r>
         <w:t xml:space="preserve">Mỗi bản ghi được gán</w:t>

</xml_diff>